<commit_message>
Part B: rewrite as flowing prose (no PEEL labels), 637 words, ready for submission
</commit_message>
<xml_diff>
--- a/engelska/uppgifter/uppgift4_community_voices/FINAL_SUBMISSION/Assignment4_PartB_LiteraryAnalysis_FirstDraft_MohammadSamiAlsharef.docx
+++ b/engelska/uppgifter/uppgift4_community_voices/FINAL_SUBMISSION/Assignment4_PartB_LiteraryAnalysis_FirstDraft_MohammadSamiAlsharef.docx
@@ -4,194 +4,177 @@
   <w:body>
     <w:p>
       <w:pPr>
-        <w:pStyle w:val="Heading1"/>
+        <w:spacing w:before="240" w:after="120"/>
       </w:pPr>
       <w:r>
-        <w:t>Assignment 4 - Part B: Literary Analysis First Draft</w:t>
-      </w:r>
-    </w:p>
-    <w:p/>
-    <w:p>
-      <w:r>
         <w:rPr>
-          <w:b w:val="0"/>
+          <w:b/>
+          <w:sz w:val="30"/>
         </w:rPr>
-        <w:t>Novel: Klara and the Sun by Kazuo Ishiguro (Faber &amp; Faber, 2021).</w:t>
+        <w:t>Assignment 4 - Part B: Literary Analysis (First Draft)</w:t>
       </w:r>
     </w:p>
     <w:p>
       <w:r>
         <w:rPr>
           <w:b w:val="0"/>
+          <w:i w:val="0"/>
+          <w:sz w:val="24"/>
         </w:rPr>
-        <w:t>Mohammad Sami Alsharef.</w:t>
+        <w:t>Mohammad Sami Alsharef</w:t>
       </w:r>
     </w:p>
-    <w:p/>
     <w:p>
       <w:r>
         <w:rPr>
           <w:b w:val="0"/>
+          <w:i w:val="0"/>
+          <w:sz w:val="24"/>
         </w:rPr>
-        <w:t>First draft only. Thesis + 3 body paragraphs. No intro and no conclusion yet, like the brief says. I'll bring this to the Second Individual Assessment Meeting and then expand it for Assignment 5.</w:t>
+        <w:t xml:space="preserve">Novel: </w:t>
+      </w:r>
+      <w:r>
+        <w:rPr>
+          <w:b w:val="0"/>
+          <w:i/>
+          <w:sz w:val="24"/>
+        </w:rPr>
+        <w:t>Klara and the Sun</w:t>
+      </w:r>
+      <w:r>
+        <w:rPr>
+          <w:b w:val="0"/>
+          <w:i w:val="0"/>
+          <w:sz w:val="24"/>
+        </w:rPr>
+        <w:t xml:space="preserve"> by Kazuo Ishiguro (Faber &amp; Faber, 2021)</w:t>
       </w:r>
     </w:p>
-    <w:p/>
-    <w:p>
-      <w:pPr>
-        <w:pStyle w:val="Heading2"/>
-      </w:pPr>
-      <w:r>
-        <w:t>Thesis</w:t>
-      </w:r>
-    </w:p>
-    <w:p/>
     <w:p>
       <w:r>
         <w:rPr>
           <w:b w:val="0"/>
+          <w:i w:val="0"/>
+          <w:sz w:val="24"/>
         </w:rPr>
-        <w:t>Klara and the Sun isn't really a story about a robot girl trying to save a sick child. For me it's a book that argues a person can't be copied, even with perfect technology. Ishiguro keeps showing that what makes Josie "Josie" doesn't sit somewhere inside her body. It sits in the people who love her, and that's the part the machine can't reach.</w:t>
+        <w:t>First draft only. Thesis + 3 body paragraphs, no intro and no conclusion (as instructed). I'll bring this to my Second Individual Assessment Meeting with Catrin and then expand it into the full essay for Assignment 5.</w:t>
       </w:r>
     </w:p>
-    <w:p/>
     <w:p>
       <w:pPr>
-        <w:pStyle w:val="Heading2"/>
+        <w:spacing w:before="240" w:after="120"/>
       </w:pPr>
       <w:r>
-        <w:t>Body 1 - Capaldi's plan falls apart on its own logic</w:t>
+        <w:rPr>
+          <w:b/>
+          <w:sz w:val="26"/>
+        </w:rPr>
+        <w:t>Thesis</w:t>
       </w:r>
     </w:p>
-    <w:p/>
     <w:p>
       <w:r>
         <w:rPr>
           <w:b w:val="0"/>
+          <w:i/>
+          <w:sz w:val="24"/>
         </w:rPr>
-        <w:t>Point. Mr Capaldi is sure that a copy of Josie will work. The book uses him to show why that idea is wrong from the start.</w:t>
+        <w:t>Klara and the Sun</w:t>
+      </w:r>
+      <w:r>
+        <w:rPr>
+          <w:b w:val="0"/>
+          <w:i w:val="0"/>
+          <w:sz w:val="24"/>
+        </w:rPr>
+        <w:t xml:space="preserve"> looks like a story about a robot trying to save a sick girl, but I think Ishiguro is actually writing about something else. He uses Klara to argue that a person can't really be copied, even with perfect technology. What makes Josie </w:t>
+      </w:r>
+      <w:r>
+        <w:rPr>
+          <w:b w:val="0"/>
+          <w:i/>
+          <w:sz w:val="24"/>
+        </w:rPr>
+        <w:t>Josie</w:t>
+      </w:r>
+      <w:r>
+        <w:rPr>
+          <w:b w:val="0"/>
+          <w:i w:val="0"/>
+          <w:sz w:val="24"/>
+        </w:rPr>
+        <w:t xml:space="preserve"> doesn't sit somewhere inside her body. It lives in the people who love her, and that's the part the machine never reaches.</w:t>
       </w:r>
     </w:p>
-    <w:p/>
+    <w:p>
+      <w:pPr>
+        <w:spacing w:before="240" w:after="120"/>
+      </w:pPr>
+      <w:r>
+        <w:rPr>
+          <w:b/>
+          <w:sz w:val="26"/>
+        </w:rPr>
+        <w:t>Body Paragraph 1</w:t>
+      </w:r>
+    </w:p>
     <w:p>
       <w:r>
         <w:rPr>
           <w:b w:val="0"/>
+          <w:i w:val="0"/>
+          <w:sz w:val="24"/>
         </w:rPr>
-        <w:t>Evidence. He tells Klara: "There's nothing there. Nothing inside Josie that's beyond the Klaras of this world to continue" (p. 224).</w:t>
+        <w:t>Mr Capaldi is the character who pushes the "you can copy a person" idea hardest in the book, and Ishiguro uses him to show why that idea collapses on its own. Capaldi tells Klara, very calmly: "There's nothing there. Nothing inside Josie that's beyond the Klaras of this world to continue" (p. 224). For him, Josie is basically a list of habits and reactions that a careful AF can scan and rebuild in the replica. The problem is that the chapters around this scene keep showing the opposite. Josie is the way she teases her mum at breakfast. She's the inside jokes only Rick really gets. She's a specific look on her face in a certain morning light. None of that is "inside" her in the way Capaldi means. It only shows up when other people are in the room with her. That's also why the Mother, in her honest moments, doesn't really believe she could love the replica. Capaldi's plan fails on its own logic, which sets up the bigger point of the novel: a person isn't stored, a person is shared.</w:t>
       </w:r>
     </w:p>
-    <w:p/>
+    <w:p>
+      <w:pPr>
+        <w:spacing w:before="240" w:after="120"/>
+      </w:pPr>
+      <w:r>
+        <w:rPr>
+          <w:b/>
+          <w:sz w:val="26"/>
+        </w:rPr>
+        <w:t>Body Paragraph 2</w:t>
+      </w:r>
+    </w:p>
     <w:p>
       <w:r>
         <w:rPr>
           <w:b w:val="0"/>
+          <w:i w:val="0"/>
+          <w:sz w:val="24"/>
         </w:rPr>
-        <w:t>Explanation. Capaldi treats Josie like a list of habits and reactions you can scan and rebuild. But the chapters around this scene keep showing the opposite. Josie is the way she teases her mum at breakfast. She's the jokes only Rick really gets. She's a specific look on her face in a certain morning light. None of that is "inside" her in the way Capaldi means. It only exists when other people are in the room with her.</w:t>
+        <w:t>By the end of the book Klara herself stops believing in the copy idea, and that's the moment my reading really clicks into place. From the Yard, she explains to Manager why she didn't try to "continue" Josie after all. She says: "There was something very special, but it wasn't inside Josie. It was inside those who loved her" (p. 306). It's a small line, easy to miss in the last pages, but it does a lot of work for the whole novel. Klara has spent the entire book trying to read humans the way she reads a street: in boxes, in grids, in repeating patterns. Here she basically gives up on that approach. The "special thing" lives in the Mother's grief, in the Father's anger at Capaldi, in Rick's loyalty. Take those people away and there's no Josie left to copy, no matter how good the body looks. So Klara, the most patient observer in the novel, ends up writing my thesis for me. The self isn't an object you can lift out of one body and slot into another. It's a meaning other people keep alive.</w:t>
       </w:r>
     </w:p>
-    <w:p/>
+    <w:p>
+      <w:pPr>
+        <w:spacing w:before="240" w:after="120"/>
+      </w:pPr>
+      <w:r>
+        <w:rPr>
+          <w:b/>
+          <w:sz w:val="26"/>
+        </w:rPr>
+        <w:t>Body Paragraph 3</w:t>
+      </w:r>
+    </w:p>
     <w:p>
       <w:r>
         <w:rPr>
           <w:b w:val="0"/>
+          <w:i w:val="0"/>
+          <w:sz w:val="24"/>
         </w:rPr>
-        <w:t>Link. That's also why the Mother, when she's honest with herself, doesn't really believe she could love the replica. Capaldi's plan fails on its own logic, and that sets up the bigger point of the novel: a person isn't stored, a person is shared.</w:t>
-      </w:r>
-    </w:p>
-    <w:p/>
-    <w:p>
-      <w:pPr>
-        <w:pStyle w:val="Heading2"/>
-      </w:pPr>
-      <w:r>
-        <w:t>Body 2 - Klara's own conclusion in the Yard</w:t>
-      </w:r>
-    </w:p>
-    <w:p/>
-    <w:p>
-      <w:r>
-        <w:rPr>
-          <w:b w:val="0"/>
-        </w:rPr>
-        <w:t>Point. By the end of the book Klara stops believing in the copy idea herself. From the Yard she finally says where she thinks Josie's "specialness" actually lived.</w:t>
-      </w:r>
-    </w:p>
-    <w:p/>
-    <w:p>
-      <w:r>
-        <w:rPr>
-          <w:b w:val="0"/>
-        </w:rPr>
-        <w:t>Evidence. Talking to Manager about why she didn't try to "continue" Josie, she says: "There was something very special, but it wasn't inside Josie. It was inside those who loved her" (p. 306).</w:t>
-      </w:r>
-    </w:p>
-    <w:p/>
-    <w:p>
-      <w:r>
-        <w:rPr>
-          <w:b w:val="0"/>
-        </w:rPr>
-        <w:t>Explanation. It's a small line and easy to miss, but it does a lot of work. Klara has spent the whole novel trying to read humans the way she reads a street: in boxes, in grids, in patterns. At the end she basically gives up on that. The "special thing" lives in the Mother's grief, in the Father's anger at Capaldi, in Rick's loyalty. Take those people away and there's no Josie left to copy, no matter how good the body looks.</w:t>
-      </w:r>
-    </w:p>
-    <w:p/>
-    <w:p>
-      <w:r>
-        <w:rPr>
-          <w:b w:val="0"/>
-        </w:rPr>
-        <w:t>Link. Klara more or less writes my thesis for me here. The self isn't an object you can lift out of one body and slot into another. It's a meaning other people keep alive.</w:t>
-      </w:r>
-    </w:p>
-    <w:p/>
-    <w:p>
-      <w:pPr>
-        <w:pStyle w:val="Heading2"/>
-      </w:pPr>
-      <w:r>
-        <w:t>Body 3 - Rick shows the same thing from the other side</w:t>
-      </w:r>
-    </w:p>
-    <w:p/>
-    <w:p>
-      <w:r>
-        <w:rPr>
-          <w:b w:val="0"/>
-        </w:rPr>
-        <w:t>Point. The novel tests the same argument socially through Rick. In a society that ranks "lifted" kids over "unlifted" ones, Rick is officially worth less. The book pushes back by showing where his real worth lives.</w:t>
-      </w:r>
-    </w:p>
-    <w:p/>
-    <w:p>
-      <w:r>
-        <w:rPr>
-          <w:b w:val="0"/>
-        </w:rPr>
-        <w:t>Evidence. At the interaction meeting the lifted kids try to make a fool of him, and Josie defends him without thinking. Later Rick tells her: "Whatever happens, you and me, we'll always be together" (p. 173).</w:t>
-      </w:r>
-    </w:p>
-    <w:p/>
-    <w:p>
-      <w:r>
-        <w:rPr>
-          <w:b w:val="0"/>
-        </w:rPr>
-        <w:t>Explanation. The lifting system thinks a person's value sits inside their genes, basically the same mistake Capaldi makes about Josie. Rick's whole storyline argues against that. His intelligence, his loyalty, even his actual future, all of it grows out of the people who really see him: Josie, his mum, and in the end Klara too. Strip those relationships out and all that's left is the "unlifted" label, and the book makes that label look small and cruel.</w:t>
-      </w:r>
-    </w:p>
-    <w:p/>
-    <w:p>
-      <w:r>
-        <w:rPr>
-          <w:b w:val="0"/>
-        </w:rPr>
-        <w:t>Link. So Rick proves the thesis from the other side. Just like Josie, he can't be reduced to what's inside his body. The real person is in the bonds around him.</w:t>
+        <w:t>The novel runs the same argument through Rick, and seeing it from his side is what convinced me the theme is on purpose. Rick is "unlifted" in a society obsessed with the lifted/unlifted measurement, so on paper he's worth less. The book pushes back hard on that. At the interaction meeting the lifted kids try to make a fool of him, and Josie defends him without thinking; later he tells her, "Whatever happens, you and me, we'll always be together" (p. 173). The lifting system thinks a person's value sits inside their genes, which is basically the same mistake Capaldi makes about Josie, just dressed up as science. Rick's whole storyline argues against that. His intelligence, his loyalty, even his actual chances in life, all of it grows out of the people who really see him: Josie, his mum, and in the end Klara as well. Strip those relationships out and all that's left is the "unlifted" label, and Ishiguro makes that label look small and cruel. So Rick proves the same thesis from the other side. Like Josie, he can't be reduced to what's inside his body. The real person lives in the bonds around him.</w:t>
       </w:r>
     </w:p>
     <w:sectPr>
       <w:pgSz w:w="12240" w:h="15840"/>
-      <w:pgMar w:top="1440" w:right="1800" w:bottom="1440" w:left="1800" w:header="720" w:footer="720" w:gutter="0"/>
+      <w:pgMar w:top="1417" w:right="1417" w:bottom="1417" w:left="1417" w:header="720" w:footer="720" w:gutter="0"/>
       <w:cols w:space="720"/>
       <w:docGrid w:linePitch="360"/>
     </w:sectPr>
@@ -562,9 +545,12 @@
     <w:name w:val="Normal"/>
     <w:qFormat/>
     <w:rsid w:val="00FC693F"/>
+    <w:pPr>
+      <w:spacing w:after="160" w:line="276" w:lineRule="auto"/>
+    </w:pPr>
     <w:rPr>
       <w:rFonts w:ascii="Calibri" w:hAnsi="Calibri"/>
-      <w:sz w:val="22"/>
+      <w:sz w:val="24"/>
     </w:rPr>
   </w:style>
   <w:style w:type="paragraph" w:styleId="Header">

</xml_diff>

<commit_message>
Part B: humanize wording, drop parenthetical citations and slashes
</commit_message>
<xml_diff>
--- a/engelska/uppgifter/uppgift4_community_voices/FINAL_SUBMISSION/Assignment4_PartB_LiteraryAnalysis_FirstDraft_MohammadSamiAlsharef.docx
+++ b/engelska/uppgifter/uppgift4_community_voices/FINAL_SUBMISSION/Assignment4_PartB_LiteraryAnalysis_FirstDraft_MohammadSamiAlsharef.docx
@@ -47,7 +47,7 @@
           <w:i w:val="0"/>
           <w:sz w:val="24"/>
         </w:rPr>
-        <w:t xml:space="preserve"> by Kazuo Ishiguro (Faber &amp; Faber, 2021)</w:t>
+        <w:t xml:space="preserve"> by Kazuo Ishiguro</w:t>
       </w:r>
     </w:p>
     <w:p>
@@ -57,7 +57,7 @@
           <w:i w:val="0"/>
           <w:sz w:val="24"/>
         </w:rPr>
-        <w:t>First draft only. Thesis + 3 body paragraphs, no intro and no conclusion (as the brief says). I'll bring this to my Second Individual Assessment Meeting with Catrin and then expand it into the full essay for Assignment 5.</w:t>
+        <w:t>First draft only. Thesis plus three body paragraphs, no intro and no conclusion, like the brief asks. I'll bring this to my Second Individual Assessment Meeting with you my teacher and then expand it into the full essay for Assignment 5.</w:t>
       </w:r>
     </w:p>
     <w:p>
@@ -125,7 +125,7 @@
           <w:i w:val="0"/>
           <w:sz w:val="24"/>
         </w:rPr>
-        <w:t>The clearest place where the novel tests the "you can copy a person" idea is the scene where Klara first sees the replica of Josie in Mr Capaldi's studio. The replica is supposed to be a perfect technical version of Josie, but Klara, who notices everything, immediately sees what's missing. She describes it like this: "Her face was very like that of the real Josie, but because there was at the eyes no kind smile, the upward curve of her lips gave her an expression I'd never seen before. The face looked disappointed and afraid" (p. 201). For me this is the whole argument of the book in one image. Capaldi has copied the body, the face, the dimensions, but the thing that actually makes Josie real, the small living warmth in her eyes, simply isn't there. The model looks "disappointed and afraid" because, in a way, even the copy senses it's not really a person. That's why the Mother, in her honest moments, doesn't really believe she could love this version. The copy fails on its own logic before it has even started.</w:t>
+        <w:t>The clearest place where the novel tests the idea that you can copy a person is the scene where Klara first sees the replica of Josie in Mr Capaldi's studio. The replica is supposed to be a perfect technical version of Josie, but Klara, who notices everything, immediately sees what's missing. She describes it like this on page 201. "Her face was very like that of the real Josie, but because there was at the eyes no kind smile, the upward curve of her lips gave her an expression I'd never seen before. The face looked disappointed and afraid." For me this is the whole argument of the book in one image. Capaldi has copied the body, the face, the dimensions, but the thing that actually makes Josie real, the small living warmth in her eyes, simply isn't there. The model looks "disappointed and afraid" because, in a way, even the copy senses it's not really a person. That's why the Mother, in her honest moments, doesn't really believe she could love this version. The copy fails on its own logic before it has even started.</w:t>
       </w:r>
     </w:p>
     <w:p>
@@ -147,7 +147,7 @@
           <w:i w:val="0"/>
           <w:sz w:val="24"/>
         </w:rPr>
-        <w:t>The other moment where the novel makes its position obvious is in the Yard, right at the end. Klara is talking to Manager about why she didn't, in the end, try to "continue" Josie inside the replica, and she finally explains where Josie's "specialness" actually was. She says: "There was something very special, but it wasn't inside Josie. It was inside those who loved her." It's a simple sentence, almost shy, but it carries the weight of the whole book. Klara has spent the entire novel trying to read humans the way she reads a street, in patterns, in grids, in observable behaviour. Right at the end she gives up on that and lands somewhere very different. The "special thing" is in the Mother's grief, in the Father's anger when he sees the replica, in Rick's loyalty even after he and Josie grow apart. Take those people away and there's no Josie left to copy, no matter how perfect the body is. So the most patient observer in the novel basically writes my thesis for me. Identity isn't an object inside a body. It's a meaning other people keep alive.</w:t>
+        <w:t>The other moment where the novel makes its position obvious is in the Yard, right at the end. Klara is talking to Manager about why she didn't, in the end, try to "continue" Josie inside the replica, and she finally explains where Josie's "specialness" actually was. She says it like this. "There was something very special, but it wasn't inside Josie. It was inside those who loved her." It's a simple sentence, almost shy, but it carries the weight of the whole book. Klara has spent the whole novel trying to read humans the way she reads a street, in patterns, in grids, in things she can see. Right at the end she gives up on that and lands somewhere very different. The "special thing" is in the Mother's grief, in the Father's anger when he sees the replica, in Rick's loyalty even after he and Josie grow apart. Take those people away and there's no Josie left to copy, no matter how perfect the body is. So the most patient observer in the novel basically writes my thesis for me. Identity isn't an object inside a body. It's a meaning other people keep alive.</w:t>
       </w:r>
     </w:p>
     <w:p>
@@ -169,7 +169,7 @@
           <w:i w:val="0"/>
           <w:sz w:val="24"/>
         </w:rPr>
-        <w:t>The novel runs the same argument socially through Rick. Rick is "unlifted" in a society obsessed with the lifted/unlifted divide, so on paper he is automatically worth less. At the interaction meeting where the lifted kids try to make a fool of him, he just says it out loud: "I don't belong here. This is a meeting for lifted kids" (p. 82). On the surface he agrees with the system, but the way Ishiguro stages the scene, with Josie defending him without thinking and Klara watching all of it, makes the system itself look small and cruel. The lifting idea locates a person's value inside their genes, which is basically the same mistake Capaldi makes about Josie, just dressed up as science. Rick's whole storyline argues against it. His intelligence, his loyalty and his real chances in life grow out of the people who actually see him: his mum, Josie, and eventually Klara. Strip those bonds out and all that's left is the "unlifted" label. So Rick proves the same thesis from the other side. Like Josie, he can't be reduced to what's inside his body. The real person lives in the connections around him.</w:t>
+        <w:t>The novel runs the same argument socially through Rick. Rick is "unlifted" in a society obsessed with who has been lifted and who has not, so on paper he is worth less. At the interaction meeting where the lifted kids try to make a fool of him, he just says it out loud on page 82. "I don't belong here. This is a meeting for lifted kids." On the surface he agrees with the system, but the way Ishiguro stages the scene, with Josie defending him without thinking and Klara watching all of it, makes the system itself look small and cruel. The lifting idea locates a person's value inside their genes, which is basically the same mistake Capaldi makes about Josie, just dressed up as science. Rick's storyline argues against it. His intelligence, his loyalty and his real chances in life grow out of the people who actually see him. His mum, Josie, and in the end Klara too. Take those bonds away and all that's left is the "unlifted" label. So Rick proves the same thesis from the other side. Like Josie, he can't be reduced to what's inside his body. The real person lives in the connections around him.</w:t>
       </w:r>
     </w:p>
     <w:sectPr>

</xml_diff>